<commit_message>
Update Relatorio Etapa 2
</commit_message>
<xml_diff>
--- a/Relatorios/Relatorio_Grupo4_MoveTe_Etapa2.docx
+++ b/Relatorios/Relatorio_Grupo4_MoveTe_Etapa2.docx
@@ -343,7 +343,10 @@
         <w:sectPr>
           <w:headerReference w:type="even" r:id="rId10"/>
           <w:headerReference w:type="default" r:id="rId11"/>
-          <w:footerReference w:type="default" r:id="rId12"/>
+          <w:footerReference w:type="even" r:id="rId12"/>
+          <w:footerReference w:type="default" r:id="rId13"/>
+          <w:headerReference w:type="first" r:id="rId14"/>
+          <w:footerReference w:type="first" r:id="rId15"/>
           <w:type w:val="continuous"/>
           <w:pgSz w:w="11907" w:h="16839"/>
           <w:pgMar w:top="1440" w:right="1800" w:bottom="1440" w:left="1800" w:header="720" w:footer="965" w:gutter="0"/>
@@ -5655,7 +5658,7 @@
               <w:spacing w:after="160"/>
             </w:pPr>
             <w:r>
-              <w:t>É necessário estar autenticado numa conta e esta ter um NIF associado;</w:t>
+              <w:t>É necessário estar autenticado numa conta;</w:t>
             </w:r>
           </w:p>
         </w:tc>
@@ -7819,7 +7822,7 @@
           <w:lang w:val="pt-PT"/>
         </w:rPr>
         <w:sectPr>
-          <w:footerReference w:type="first" r:id="rId13"/>
+          <w:footerReference w:type="first" r:id="rId16"/>
           <w:pgSz w:w="11907" w:h="16839" w:code="9"/>
           <w:pgMar w:top="1418" w:right="1701" w:bottom="1418" w:left="1701" w:header="720" w:footer="720" w:gutter="0"/>
           <w:pgNumType w:start="1"/>
@@ -7850,6 +7853,9 @@
         <w:jc w:val="center"/>
       </w:pPr>
       <w:r>
+        <w:rPr>
+          <w:noProof/>
+        </w:rPr>
         <w:drawing>
           <wp:inline distT="0" distB="0" distL="0" distR="0" wp14:anchorId="43076C3A" wp14:editId="22D3498A">
             <wp:extent cx="8900795" cy="3821430"/>
@@ -7866,7 +7872,7 @@
                     <pic:cNvPicPr/>
                   </pic:nvPicPr>
                   <pic:blipFill>
-                    <a:blip r:embed="rId14"/>
+                    <a:blip r:embed="rId17"/>
                     <a:stretch>
                       <a:fillRect/>
                     </a:stretch>
@@ -7912,7 +7918,7 @@
         <w:ind w:firstLine="0"/>
         <w:jc w:val="left"/>
         <w:sectPr>
-          <w:headerReference w:type="default" r:id="rId15"/>
+          <w:headerReference w:type="default" r:id="rId18"/>
           <w:pgSz w:w="16839" w:h="11907" w:orient="landscape" w:code="9"/>
           <w:pgMar w:top="1699" w:right="1411" w:bottom="1699" w:left="1411" w:header="720" w:footer="720" w:gutter="0"/>
           <w:cols w:space="720"/>
@@ -7977,6 +7983,16 @@
 </file>
 
 <file path=word/footer1.xml><?xml version="1.0" encoding="utf-8"?>
+<w:ftr xmlns:wpc="http://schemas.microsoft.com/office/word/2010/wordprocessingCanvas" xmlns:cx="http://schemas.microsoft.com/office/drawing/2014/chartex" xmlns:cx1="http://schemas.microsoft.com/office/drawing/2015/9/8/chartex" xmlns:cx2="http://schemas.microsoft.com/office/drawing/2015/10/21/chartex" xmlns:cx3="http://schemas.microsoft.com/office/drawing/2016/5/9/chartex" xmlns:cx4="http://schemas.microsoft.com/office/drawing/2016/5/10/chartex" xmlns:cx5="http://schemas.microsoft.com/office/drawing/2016/5/11/chartex" xmlns:cx6="http://schemas.microsoft.com/office/drawing/2016/5/12/chartex" xmlns:cx7="http://schemas.microsoft.com/office/drawing/2016/5/13/chartex" xmlns:cx8="http://schemas.microsoft.com/office/drawing/2016/5/14/chartex" xmlns:mc="http://schemas.openxmlformats.org/markup-compatibility/2006" xmlns:aink="http://schemas.microsoft.com/office/drawing/2016/ink" xmlns:am3d="http://schemas.microsoft.com/office/drawing/2017/model3d" xmlns:o="urn:schemas-microsoft-com:office:office" xmlns:oel="http://schemas.microsoft.com/office/2019/extlst" xmlns:r="http://schemas.openxmlformats.org/officeDocument/2006/relationships" xmlns:m="http://schemas.openxmlformats.org/officeDocument/2006/math" xmlns:v="urn:schemas-microsoft-com:vml" xmlns:wp14="http://schemas.microsoft.com/office/word/2010/wordprocessingDrawing" xmlns:wp="http://schemas.openxmlformats.org/drawingml/2006/wordprocessingDrawing" xmlns:w10="urn:schemas-microsoft-com:office:word" xmlns:w="http://schemas.openxmlformats.org/wordprocessingml/2006/main" xmlns:w14="http://schemas.microsoft.com/office/word/2010/wordml" xmlns:w15="http://schemas.microsoft.com/office/word/2012/wordml" xmlns:w16cex="http://schemas.microsoft.com/office/word/2018/wordml/cex" xmlns:w16cid="http://schemas.microsoft.com/office/word/2016/wordml/cid" xmlns:w16="http://schemas.microsoft.com/office/word/2018/wordml" xmlns:w16du="http://schemas.microsoft.com/office/word/2023/wordml/word16du" xmlns:w16sdtdh="http://schemas.microsoft.com/office/word/2020/wordml/sdtdatahash" xmlns:w16sdtfl="http://schemas.microsoft.com/office/word/2024/wordml/sdtformatlock" xmlns:w16se="http://schemas.microsoft.com/office/word/2015/wordml/symex" xmlns:wpg="http://schemas.microsoft.com/office/word/2010/wordprocessingGroup" xmlns:wpi="http://schemas.microsoft.com/office/word/2010/wordprocessingInk" xmlns:wne="http://schemas.microsoft.com/office/word/2006/wordml" xmlns:wps="http://schemas.microsoft.com/office/word/2010/wordprocessingShape" mc:Ignorable="w14 w15 w16se w16cid w16 w16cex w16sdtdh w16sdtfl w16du wp14">
+  <w:p>
+    <w:pPr>
+      <w:pStyle w:val="Rodap"/>
+    </w:pPr>
+  </w:p>
+</w:ftr>
+</file>
+
+<file path=word/footer2.xml><?xml version="1.0" encoding="utf-8"?>
 <w:ftr xmlns:wpc="http://schemas.microsoft.com/office/word/2010/wordprocessingCanvas" xmlns:cx="http://schemas.microsoft.com/office/drawing/2014/chartex" xmlns:cx1="http://schemas.microsoft.com/office/drawing/2015/9/8/chartex" xmlns:cx2="http://schemas.microsoft.com/office/drawing/2015/10/21/chartex" xmlns:cx3="http://schemas.microsoft.com/office/drawing/2016/5/9/chartex" xmlns:cx4="http://schemas.microsoft.com/office/drawing/2016/5/10/chartex" xmlns:cx5="http://schemas.microsoft.com/office/drawing/2016/5/11/chartex" xmlns:cx6="http://schemas.microsoft.com/office/drawing/2016/5/12/chartex" xmlns:cx7="http://schemas.microsoft.com/office/drawing/2016/5/13/chartex" xmlns:cx8="http://schemas.microsoft.com/office/drawing/2016/5/14/chartex" xmlns:mc="http://schemas.openxmlformats.org/markup-compatibility/2006" xmlns:aink="http://schemas.microsoft.com/office/drawing/2016/ink" xmlns:am3d="http://schemas.microsoft.com/office/drawing/2017/model3d" xmlns:o="urn:schemas-microsoft-com:office:office" xmlns:oel="http://schemas.microsoft.com/office/2019/extlst" xmlns:r="http://schemas.openxmlformats.org/officeDocument/2006/relationships" xmlns:m="http://schemas.openxmlformats.org/officeDocument/2006/math" xmlns:v="urn:schemas-microsoft-com:vml" xmlns:wp14="http://schemas.microsoft.com/office/word/2010/wordprocessingDrawing" xmlns:wp="http://schemas.openxmlformats.org/drawingml/2006/wordprocessingDrawing" xmlns:w10="urn:schemas-microsoft-com:office:word" xmlns:w="http://schemas.openxmlformats.org/wordprocessingml/2006/main" xmlns:w14="http://schemas.microsoft.com/office/word/2010/wordml" xmlns:w15="http://schemas.microsoft.com/office/word/2012/wordml" xmlns:w16cex="http://schemas.microsoft.com/office/word/2018/wordml/cex" xmlns:w16cid="http://schemas.microsoft.com/office/word/2016/wordml/cid" xmlns:w16="http://schemas.microsoft.com/office/word/2018/wordml" xmlns:w16du="http://schemas.microsoft.com/office/word/2023/wordml/word16du" xmlns:w16sdtdh="http://schemas.microsoft.com/office/word/2020/wordml/sdtdatahash" xmlns:w16sdtfl="http://schemas.microsoft.com/office/word/2024/wordml/sdtformatlock" xmlns:w16se="http://schemas.microsoft.com/office/word/2015/wordml/symex" xmlns:wpg="http://schemas.microsoft.com/office/word/2010/wordprocessingGroup" xmlns:wpi="http://schemas.microsoft.com/office/word/2010/wordprocessingInk" xmlns:wne="http://schemas.microsoft.com/office/word/2006/wordml" xmlns:wps="http://schemas.microsoft.com/office/word/2010/wordprocessingShape" mc:Ignorable="w14 w15 w16se w16cid w16 w16cex w16sdtdh w16sdtfl w16du wp14">
   <w:sdt>
     <w:sdtPr>
@@ -8020,7 +8036,17 @@
 </w:ftr>
 </file>
 
-<file path=word/footer2.xml><?xml version="1.0" encoding="utf-8"?>
+<file path=word/footer3.xml><?xml version="1.0" encoding="utf-8"?>
+<w:ftr xmlns:wpc="http://schemas.microsoft.com/office/word/2010/wordprocessingCanvas" xmlns:cx="http://schemas.microsoft.com/office/drawing/2014/chartex" xmlns:cx1="http://schemas.microsoft.com/office/drawing/2015/9/8/chartex" xmlns:cx2="http://schemas.microsoft.com/office/drawing/2015/10/21/chartex" xmlns:cx3="http://schemas.microsoft.com/office/drawing/2016/5/9/chartex" xmlns:cx4="http://schemas.microsoft.com/office/drawing/2016/5/10/chartex" xmlns:cx5="http://schemas.microsoft.com/office/drawing/2016/5/11/chartex" xmlns:cx6="http://schemas.microsoft.com/office/drawing/2016/5/12/chartex" xmlns:cx7="http://schemas.microsoft.com/office/drawing/2016/5/13/chartex" xmlns:cx8="http://schemas.microsoft.com/office/drawing/2016/5/14/chartex" xmlns:mc="http://schemas.openxmlformats.org/markup-compatibility/2006" xmlns:aink="http://schemas.microsoft.com/office/drawing/2016/ink" xmlns:am3d="http://schemas.microsoft.com/office/drawing/2017/model3d" xmlns:o="urn:schemas-microsoft-com:office:office" xmlns:oel="http://schemas.microsoft.com/office/2019/extlst" xmlns:r="http://schemas.openxmlformats.org/officeDocument/2006/relationships" xmlns:m="http://schemas.openxmlformats.org/officeDocument/2006/math" xmlns:v="urn:schemas-microsoft-com:vml" xmlns:wp14="http://schemas.microsoft.com/office/word/2010/wordprocessingDrawing" xmlns:wp="http://schemas.openxmlformats.org/drawingml/2006/wordprocessingDrawing" xmlns:w10="urn:schemas-microsoft-com:office:word" xmlns:w="http://schemas.openxmlformats.org/wordprocessingml/2006/main" xmlns:w14="http://schemas.microsoft.com/office/word/2010/wordml" xmlns:w15="http://schemas.microsoft.com/office/word/2012/wordml" xmlns:w16cex="http://schemas.microsoft.com/office/word/2018/wordml/cex" xmlns:w16cid="http://schemas.microsoft.com/office/word/2016/wordml/cid" xmlns:w16="http://schemas.microsoft.com/office/word/2018/wordml" xmlns:w16du="http://schemas.microsoft.com/office/word/2023/wordml/word16du" xmlns:w16sdtdh="http://schemas.microsoft.com/office/word/2020/wordml/sdtdatahash" xmlns:w16sdtfl="http://schemas.microsoft.com/office/word/2024/wordml/sdtformatlock" xmlns:w16se="http://schemas.microsoft.com/office/word/2015/wordml/symex" xmlns:wpg="http://schemas.microsoft.com/office/word/2010/wordprocessingGroup" xmlns:wpi="http://schemas.microsoft.com/office/word/2010/wordprocessingInk" xmlns:wne="http://schemas.microsoft.com/office/word/2006/wordml" xmlns:wps="http://schemas.microsoft.com/office/word/2010/wordprocessingShape" mc:Ignorable="w14 w15 w16se w16cid w16 w16cex w16sdtdh w16sdtfl w16du wp14">
+  <w:p>
+    <w:pPr>
+      <w:pStyle w:val="Rodap"/>
+    </w:pPr>
+  </w:p>
+</w:ftr>
+</file>
+
+<file path=word/footer4.xml><?xml version="1.0" encoding="utf-8"?>
 <w:ftr xmlns:wpc="http://schemas.microsoft.com/office/word/2010/wordprocessingCanvas" xmlns:cx="http://schemas.microsoft.com/office/drawing/2014/chartex" xmlns:cx1="http://schemas.microsoft.com/office/drawing/2015/9/8/chartex" xmlns:cx2="http://schemas.microsoft.com/office/drawing/2015/10/21/chartex" xmlns:cx3="http://schemas.microsoft.com/office/drawing/2016/5/9/chartex" xmlns:cx4="http://schemas.microsoft.com/office/drawing/2016/5/10/chartex" xmlns:cx5="http://schemas.microsoft.com/office/drawing/2016/5/11/chartex" xmlns:cx6="http://schemas.microsoft.com/office/drawing/2016/5/12/chartex" xmlns:cx7="http://schemas.microsoft.com/office/drawing/2016/5/13/chartex" xmlns:cx8="http://schemas.microsoft.com/office/drawing/2016/5/14/chartex" xmlns:mc="http://schemas.openxmlformats.org/markup-compatibility/2006" xmlns:aink="http://schemas.microsoft.com/office/drawing/2016/ink" xmlns:am3d="http://schemas.microsoft.com/office/drawing/2017/model3d" xmlns:o="urn:schemas-microsoft-com:office:office" xmlns:oel="http://schemas.microsoft.com/office/2019/extlst" xmlns:r="http://schemas.openxmlformats.org/officeDocument/2006/relationships" xmlns:m="http://schemas.openxmlformats.org/officeDocument/2006/math" xmlns:v="urn:schemas-microsoft-com:vml" xmlns:wp14="http://schemas.microsoft.com/office/word/2010/wordprocessingDrawing" xmlns:wp="http://schemas.openxmlformats.org/drawingml/2006/wordprocessingDrawing" xmlns:w10="urn:schemas-microsoft-com:office:word" xmlns:w="http://schemas.openxmlformats.org/wordprocessingml/2006/main" xmlns:w14="http://schemas.microsoft.com/office/word/2010/wordml" xmlns:w15="http://schemas.microsoft.com/office/word/2012/wordml" xmlns:w16cex="http://schemas.microsoft.com/office/word/2018/wordml/cex" xmlns:w16cid="http://schemas.microsoft.com/office/word/2016/wordml/cid" xmlns:w16="http://schemas.microsoft.com/office/word/2018/wordml" xmlns:w16du="http://schemas.microsoft.com/office/word/2023/wordml/word16du" xmlns:w16sdtdh="http://schemas.microsoft.com/office/word/2020/wordml/sdtdatahash" xmlns:w16sdtfl="http://schemas.microsoft.com/office/word/2024/wordml/sdtformatlock" xmlns:w16se="http://schemas.microsoft.com/office/word/2015/wordml/symex" xmlns:wpg="http://schemas.microsoft.com/office/word/2010/wordprocessingGroup" xmlns:wpi="http://schemas.microsoft.com/office/word/2010/wordprocessingInk" xmlns:wne="http://schemas.microsoft.com/office/word/2006/wordml" xmlns:wps="http://schemas.microsoft.com/office/word/2010/wordprocessingShape" mc:Ignorable="w14 w15 w16se w16cid w16 w16cex w16sdtdh w16sdtfl w16du wp14">
   <w:p>
     <w:pPr>
@@ -8166,6 +8192,16 @@
 <w:hdr xmlns:wpc="http://schemas.microsoft.com/office/word/2010/wordprocessingCanvas" xmlns:cx="http://schemas.microsoft.com/office/drawing/2014/chartex" xmlns:cx1="http://schemas.microsoft.com/office/drawing/2015/9/8/chartex" xmlns:cx2="http://schemas.microsoft.com/office/drawing/2015/10/21/chartex" xmlns:cx3="http://schemas.microsoft.com/office/drawing/2016/5/9/chartex" xmlns:cx4="http://schemas.microsoft.com/office/drawing/2016/5/10/chartex" xmlns:cx5="http://schemas.microsoft.com/office/drawing/2016/5/11/chartex" xmlns:cx6="http://schemas.microsoft.com/office/drawing/2016/5/12/chartex" xmlns:cx7="http://schemas.microsoft.com/office/drawing/2016/5/13/chartex" xmlns:cx8="http://schemas.microsoft.com/office/drawing/2016/5/14/chartex" xmlns:mc="http://schemas.openxmlformats.org/markup-compatibility/2006" xmlns:aink="http://schemas.microsoft.com/office/drawing/2016/ink" xmlns:am3d="http://schemas.microsoft.com/office/drawing/2017/model3d" xmlns:o="urn:schemas-microsoft-com:office:office" xmlns:oel="http://schemas.microsoft.com/office/2019/extlst" xmlns:r="http://schemas.openxmlformats.org/officeDocument/2006/relationships" xmlns:m="http://schemas.openxmlformats.org/officeDocument/2006/math" xmlns:v="urn:schemas-microsoft-com:vml" xmlns:wp14="http://schemas.microsoft.com/office/word/2010/wordprocessingDrawing" xmlns:wp="http://schemas.openxmlformats.org/drawingml/2006/wordprocessingDrawing" xmlns:w10="urn:schemas-microsoft-com:office:word" xmlns:w="http://schemas.openxmlformats.org/wordprocessingml/2006/main" xmlns:w14="http://schemas.microsoft.com/office/word/2010/wordml" xmlns:w15="http://schemas.microsoft.com/office/word/2012/wordml" xmlns:w16cex="http://schemas.microsoft.com/office/word/2018/wordml/cex" xmlns:w16cid="http://schemas.microsoft.com/office/word/2016/wordml/cid" xmlns:w16="http://schemas.microsoft.com/office/word/2018/wordml" xmlns:w16du="http://schemas.microsoft.com/office/word/2023/wordml/word16du" xmlns:w16sdtdh="http://schemas.microsoft.com/office/word/2020/wordml/sdtdatahash" xmlns:w16sdtfl="http://schemas.microsoft.com/office/word/2024/wordml/sdtformatlock" xmlns:w16se="http://schemas.microsoft.com/office/word/2015/wordml/symex" xmlns:wpg="http://schemas.microsoft.com/office/word/2010/wordprocessingGroup" xmlns:wpi="http://schemas.microsoft.com/office/word/2010/wordprocessingInk" xmlns:wne="http://schemas.microsoft.com/office/word/2006/wordml" xmlns:wps="http://schemas.microsoft.com/office/word/2010/wordprocessingShape" mc:Ignorable="w14 w15 w16se w16cid w16 w16cex w16sdtdh w16sdtfl w16du wp14">
   <w:p>
     <w:pPr>
+      <w:pStyle w:val="Cabealho"/>
+    </w:pPr>
+  </w:p>
+</w:hdr>
+</file>
+
+<file path=word/header4.xml><?xml version="1.0" encoding="utf-8"?>
+<w:hdr xmlns:wpc="http://schemas.microsoft.com/office/word/2010/wordprocessingCanvas" xmlns:cx="http://schemas.microsoft.com/office/drawing/2014/chartex" xmlns:cx1="http://schemas.microsoft.com/office/drawing/2015/9/8/chartex" xmlns:cx2="http://schemas.microsoft.com/office/drawing/2015/10/21/chartex" xmlns:cx3="http://schemas.microsoft.com/office/drawing/2016/5/9/chartex" xmlns:cx4="http://schemas.microsoft.com/office/drawing/2016/5/10/chartex" xmlns:cx5="http://schemas.microsoft.com/office/drawing/2016/5/11/chartex" xmlns:cx6="http://schemas.microsoft.com/office/drawing/2016/5/12/chartex" xmlns:cx7="http://schemas.microsoft.com/office/drawing/2016/5/13/chartex" xmlns:cx8="http://schemas.microsoft.com/office/drawing/2016/5/14/chartex" xmlns:mc="http://schemas.openxmlformats.org/markup-compatibility/2006" xmlns:aink="http://schemas.microsoft.com/office/drawing/2016/ink" xmlns:am3d="http://schemas.microsoft.com/office/drawing/2017/model3d" xmlns:o="urn:schemas-microsoft-com:office:office" xmlns:oel="http://schemas.microsoft.com/office/2019/extlst" xmlns:r="http://schemas.openxmlformats.org/officeDocument/2006/relationships" xmlns:m="http://schemas.openxmlformats.org/officeDocument/2006/math" xmlns:v="urn:schemas-microsoft-com:vml" xmlns:wp14="http://schemas.microsoft.com/office/word/2010/wordprocessingDrawing" xmlns:wp="http://schemas.openxmlformats.org/drawingml/2006/wordprocessingDrawing" xmlns:w10="urn:schemas-microsoft-com:office:word" xmlns:w="http://schemas.openxmlformats.org/wordprocessingml/2006/main" xmlns:w14="http://schemas.microsoft.com/office/word/2010/wordml" xmlns:w15="http://schemas.microsoft.com/office/word/2012/wordml" xmlns:w16cex="http://schemas.microsoft.com/office/word/2018/wordml/cex" xmlns:w16cid="http://schemas.microsoft.com/office/word/2016/wordml/cid" xmlns:w16="http://schemas.microsoft.com/office/word/2018/wordml" xmlns:w16du="http://schemas.microsoft.com/office/word/2023/wordml/word16du" xmlns:w16sdtdh="http://schemas.microsoft.com/office/word/2020/wordml/sdtdatahash" xmlns:w16sdtfl="http://schemas.microsoft.com/office/word/2024/wordml/sdtformatlock" xmlns:w16se="http://schemas.microsoft.com/office/word/2015/wordml/symex" xmlns:wpg="http://schemas.microsoft.com/office/word/2010/wordprocessingGroup" xmlns:wpi="http://schemas.microsoft.com/office/word/2010/wordprocessingInk" xmlns:wne="http://schemas.microsoft.com/office/word/2006/wordml" xmlns:wps="http://schemas.microsoft.com/office/word/2010/wordprocessingShape" mc:Ignorable="w14 w15 w16se w16cid w16 w16cex w16sdtdh w16sdtfl w16du wp14">
+  <w:p>
+    <w:pPr>
       <w:pBdr>
         <w:bottom w:val="single" w:sz="4" w:space="1" w:color="auto"/>
       </w:pBdr>
@@ -8178,7 +8214,7 @@
       <w:rPr>
         <w:lang w:val="en-US"/>
       </w:rPr>
-      <w:t>Poppy and Max</w:t>
+      <w:t>MoveTe</w:t>
     </w:r>
   </w:p>
 </w:hdr>

</xml_diff>